<commit_message>
Expand comprehensive trilingual agent guide and add dashboard downloads.
30-step EN/SI/TA agent handbook with regenerated Word docs, dashboard guide card, and DB metadata update patch.

Co-authored-by: Cursor <cursoragent@cursor.com>
</commit_message>
<xml_diff>
--- a/apps/web/public/help/agent-guide/trimma-agent-guide-ta.docx
+++ b/apps/web/public/help/agent-guide/trimma-agent-guide-ta.docx
@@ -87,7 +87,7 @@
           <w:sz w:val="22"/>
           <w:szCs w:val="22"/>
         </w:rPr>
-        <w:t xml:space="preserve">trimma.io/agent/login க்குச் செல்லுங்கள். Trimma admin வழங்கிய email மற்றும் password மூலம் sign in செய்யுங்கள்.</w:t>
+        <w:t xml:space="preserve">trimma.io/agent/login திறக்கவும். Trimma admin வழங்கிய email மற்றும் password உள்ளிடவும். Salon owners மற்றும் customers Google பயன்படுத்துகிறார்கள் — agents email/password மட்டும். Login பிறகு Agent Cockpit (Dashboard) திறக்கும்.</w:t>
       </w:r>
     </w:p>
     <w:p>
@@ -130,19 +130,19 @@
           <w:sz w:val="26"/>
           <w:szCs w:val="26"/>
         </w:rPr>
-        <w:t xml:space="preserve">படி 2: உங்கள் பாத்திரம் &amp; பொறுப்புகள்</w:t>
-      </w:r>
-    </w:p>
-    <w:p>
-      <w:pPr>
-        <w:spacing w:after="120"/>
-      </w:pPr>
-      <w:r>
-        <w:rPr>
-          <w:sz w:val="22"/>
-          <w:szCs w:val="22"/>
-        </w:rPr>
-        <w:t xml:space="preserve">Trimma Field Agent ஆக: territories இல் சலூன்களைக் கண்டறியுங்கள், verify செய்யுங்கள், owners ஐ invite செய்யுங்கள், bookings enable செய்யுங்கள், commissions சம்பாதியுங்கள்.</w:t>
+        <w:t xml:space="preserve">படி 2: Trimma Field Agent பாத்திரம்</w:t>
+      </w:r>
+    </w:p>
+    <w:p>
+      <w:pPr>
+        <w:spacing w:after="120"/>
+      </w:pPr>
+      <w:r>
+        <w:rPr>
+          <w:sz w:val="22"/>
+          <w:szCs w:val="22"/>
+        </w:rPr>
+        <w:t xml:space="preserve">நீங்கள் இலங்கையில் Trimma இன் on-the-ground பங்குதாரர். Territories இல் salons கண்டறியுங்கள், site இல் verify செய்யுங்கள், owners ஐ invite செய்யுங்கள், bookings enable செய்யுங்கள், admin விற்கு submit செய்யுங்கள். வெற்றிகரமாக onboard செய்த salons இல் commissions கிடைக்கும்.</w:t>
       </w:r>
     </w:p>
     <w:tbl>
@@ -188,7 +188,7 @@
                 <w:sz w:val="20"/>
                 <w:szCs w:val="20"/>
               </w:rPr>
-              <w:t xml:space="preserve">Admin assign செய்த salons மட்டுமே காண்பீர்கள்.</w:t>
+              <w:t xml:space="preserve">Admin assign செய்த territories மட்டுமே வேலை செய்யுங்கள்.</w:t>
             </w:r>
           </w:p>
         </w:tc>
@@ -207,19 +207,151 @@
           <w:sz w:val="26"/>
           <w:szCs w:val="26"/>
         </w:rPr>
-        <w:t xml:space="preserve">படி 3: Agent Cockpit (Dashboard)</w:t>
-      </w:r>
-    </w:p>
-    <w:p>
-      <w:pPr>
-        <w:spacing w:after="120"/>
-      </w:pPr>
-      <w:r>
-        <w:rPr>
-          <w:sz w:val="22"/>
-          <w:szCs w:val="22"/>
-        </w:rPr>
-        <w:t xml:space="preserve">ஒவ்வொரு நாளும் Dashboard இல் தொடங்குங்கள். KPI cards மற்றும் priorities மதிப்பாய்வு செய்யுங்கள்.</w:t>
+        <w:t xml:space="preserve">படி 3: தொழில்முறை தரநிலைகள்</w:t>
+      </w:r>
+    </w:p>
+    <w:p>
+      <w:pPr>
+        <w:spacing w:after="120"/>
+      </w:pPr>
+      <w:r>
+        <w:rPr>
+          <w:sz w:val="22"/>
+          <w:szCs w:val="22"/>
+        </w:rPr>
+        <w:t xml:space="preserve">Submit செய்வதற்கு முன் salon ஐ நேரில் பார்வையிடுங்கள். Owner இன் உண்மையான Gmail பயன்படுத்துங்கள். WhatsApp எண்ணை confirm செய்யுங்கள். Agent notes இல் உண்மையான தகவல் எழுதுங்கள். Trimma tier க்கு ஏற்ப commission rates மட்டும் promise செய்யுங்கள்.</w:t>
+      </w:r>
+    </w:p>
+    <w:tbl>
+      <w:tblPr>
+        <w:tblW w:type="pct" w:w="100%"/>
+        <w:tblBorders>
+          <w:top w:val="single" w:color="auto" w:sz="4"/>
+          <w:left w:val="single" w:color="auto" w:sz="4"/>
+          <w:bottom w:val="single" w:color="auto" w:sz="4"/>
+          <w:right w:val="single" w:color="auto" w:sz="4"/>
+          <w:insideH w:val="single" w:color="auto" w:sz="4"/>
+          <w:insideV w:val="single" w:color="auto" w:sz="4"/>
+        </w:tblBorders>
+      </w:tblPr>
+      <w:tblGrid>
+        <w:gridCol w:w="100"/>
+      </w:tblGrid>
+      <w:tr>
+        <w:tc>
+          <w:tcPr>
+            <w:tcBorders>
+              <w:top w:val="single" w:color="F5B700" w:sz="1"/>
+              <w:left w:val="single" w:color="F5B700" w:sz="1"/>
+              <w:bottom w:val="single" w:color="F5B700" w:sz="1"/>
+              <w:right w:val="single" w:color="F5B700" w:sz="1"/>
+            </w:tcBorders>
+            <w:shd w:fill="FFF8E1" w:val="clear"/>
+          </w:tcPr>
+          <w:p>
+            <w:r>
+              <w:rPr>
+                <w:b/>
+                <w:bCs/>
+                <w:color w:val="92400E"/>
+                <w:sz w:val="20"/>
+                <w:szCs w:val="20"/>
+              </w:rPr>
+              <w:t xml:space="preserve">உதவிக்குறிப்பு: </w:t>
+            </w:r>
+            <w:r>
+              <w:rPr>
+                <w:color w:val="92400E"/>
+                <w:sz w:val="20"/>
+                <w:szCs w:val="20"/>
+              </w:rPr>
+              <w:t xml:space="preserve">முதல் impression முக்கியம் — process ஐ அறிந்த agents ஐ owners நம்புவார்கள்.</w:t>
+            </w:r>
+          </w:p>
+        </w:tc>
+      </w:tr>
+    </w:tbl>
+    <w:p>
+      <w:pPr>
+        <w:pStyle w:val="Heading2"/>
+        <w:spacing w:after="120" w:before="280"/>
+      </w:pPr>
+      <w:r>
+        <w:rPr>
+          <w:b/>
+          <w:bCs/>
+          <w:color w:val="1A1C29"/>
+          <w:sz w:val="26"/>
+          <w:szCs w:val="26"/>
+        </w:rPr>
+        <w:t xml:space="preserve">படி 4: Portal navigation</w:t>
+      </w:r>
+    </w:p>
+    <w:p>
+      <w:pPr>
+        <w:spacing w:after="120"/>
+      </w:pPr>
+      <w:r>
+        <w:rPr>
+          <w:sz w:val="22"/>
+          <w:szCs w:val="22"/>
+        </w:rPr>
+        <w:t xml:space="preserve">Desktop: dark sidebar — Overview (Dashboard, Profile, Agent Help), Salons (My Salons, Territory Explorer, Add Manual Lead, Salon Creation, Salon Approval), Performance (Commissions). Mobile: bottom nav — Home, Salons, Editor, Profile.</w:t>
+      </w:r>
+    </w:p>
+    <w:p>
+      <w:pPr>
+        <w:spacing w:after="160"/>
+      </w:pPr>
+      <w:r>
+        <w:rPr>
+          <w:b/>
+          <w:bCs/>
+          <w:i/>
+          <w:iCs/>
+          <w:color w:val="71717A"/>
+          <w:sz w:val="20"/>
+          <w:szCs w:val="20"/>
+        </w:rPr>
+        <w:t xml:space="preserve">திரை: </w:t>
+      </w:r>
+      <w:r>
+        <w:rPr>
+          <w:i/>
+          <w:iCs/>
+          <w:color w:val="71717A"/>
+          <w:sz w:val="20"/>
+          <w:szCs w:val="20"/>
+        </w:rPr>
+        <w:t xml:space="preserve">Sidebar + mobile nav</w:t>
+      </w:r>
+    </w:p>
+    <w:p>
+      <w:pPr>
+        <w:pStyle w:val="Heading2"/>
+        <w:spacing w:after="120" w:before="280"/>
+      </w:pPr>
+      <w:r>
+        <w:rPr>
+          <w:b/>
+          <w:bCs/>
+          <w:color w:val="1A1C29"/>
+          <w:sz w:val="26"/>
+          <w:szCs w:val="26"/>
+        </w:rPr>
+        <w:t xml:space="preserve">படி 5: Agent Cockpit (Dashboard)</w:t>
+      </w:r>
+    </w:p>
+    <w:p>
+      <w:pPr>
+        <w:spacing w:after="120"/>
+      </w:pPr>
+      <w:r>
+        <w:rPr>
+          <w:sz w:val="22"/>
+          <w:szCs w:val="22"/>
+        </w:rPr>
+        <w:t xml:space="preserve">ஒவ்வொரு வேலை நாளும் இங்கிருந்து தொடங்குங்கள். KPI cards, Today's Priorities, Recent Salons, Territory shortcut, Earnings, Salons Needing Action பாருங்கள். View Lead Sheet மூலம் Salon Creation க்கு செல்லுங்கள்.</w:t>
       </w:r>
     </w:p>
     <w:p>
@@ -262,19 +394,74 @@
           <w:sz w:val="26"/>
           <w:szCs w:val="26"/>
         </w:rPr>
-        <w:t xml:space="preserve">படி 4: My Salons</w:t>
-      </w:r>
-    </w:p>
-    <w:p>
-      <w:pPr>
-        <w:spacing w:after="120"/>
-      </w:pPr>
-      <w:r>
-        <w:rPr>
-          <w:sz w:val="22"/>
-          <w:szCs w:val="22"/>
-        </w:rPr>
-        <w:t xml:space="preserve">உங்களுக்கு assign செய்யப்பட்ட அனைத்து salons ஐயும் காணுங்கள். Filter, search, Manage பயன்படுத்துங்கள்.</w:t>
+        <w:t xml:space="preserve">படி 6: KPI cards விளக்கம்</w:t>
+      </w:r>
+    </w:p>
+    <w:p>
+      <w:pPr>
+        <w:spacing w:after="120"/>
+      </w:pPr>
+      <w:r>
+        <w:rPr>
+          <w:sz w:val="22"/>
+          <w:szCs w:val="22"/>
+        </w:rPr>
+        <w:t xml:space="preserve">Assigned Salons = உங்களுக்கு linked salons. In Progress = இன்னும் live அல்ல. Live Salons = marketplace bookings. Total Earnings = booking + subscription commissions.</w:t>
+      </w:r>
+    </w:p>
+    <w:p>
+      <w:pPr>
+        <w:spacing w:after="160"/>
+      </w:pPr>
+      <w:r>
+        <w:rPr>
+          <w:b/>
+          <w:bCs/>
+          <w:i/>
+          <w:iCs/>
+          <w:color w:val="71717A"/>
+          <w:sz w:val="20"/>
+          <w:szCs w:val="20"/>
+        </w:rPr>
+        <w:t xml:space="preserve">திரை: </w:t>
+      </w:r>
+      <w:r>
+        <w:rPr>
+          <w:i/>
+          <w:iCs/>
+          <w:color w:val="71717A"/>
+          <w:sz w:val="20"/>
+          <w:szCs w:val="20"/>
+        </w:rPr>
+        <w:t xml:space="preserve">KPI cards</w:t>
+      </w:r>
+    </w:p>
+    <w:p>
+      <w:pPr>
+        <w:pStyle w:val="Heading2"/>
+        <w:spacing w:after="120" w:before="280"/>
+      </w:pPr>
+      <w:r>
+        <w:rPr>
+          <w:b/>
+          <w:bCs/>
+          <w:color w:val="1A1C29"/>
+          <w:sz w:val="26"/>
+          <w:szCs w:val="26"/>
+        </w:rPr>
+        <w:t xml:space="preserve">படி 7: My Salons — salon பட்டியல்</w:t>
+      </w:r>
+    </w:p>
+    <w:p>
+      <w:pPr>
+        <w:spacing w:after="120"/>
+      </w:pPr>
+      <w:r>
+        <w:rPr>
+          <w:sz w:val="22"/>
+          <w:szCs w:val="22"/>
+        </w:rPr>
+        <w:t xml:space="preserve">உங்களுக்கு assign செய்யப்பட்ட அனைத்து salons. Summary cards மற்றும் table — name, status, contact, owner Gmail, subscription, actions.</w:t>
       </w:r>
     </w:p>
     <w:p>
@@ -317,19 +504,151 @@
           <w:sz w:val="26"/>
           <w:szCs w:val="26"/>
         </w:rPr>
-        <w:t xml:space="preserve">படி 5: Territory Explorer</w:t>
-      </w:r>
-    </w:p>
-    <w:p>
-      <w:pPr>
-        <w:spacing w:after="120"/>
-      </w:pPr>
-      <w:r>
-        <w:rPr>
-          <w:sz w:val="22"/>
-          <w:szCs w:val="22"/>
-        </w:rPr>
-        <w:t xml:space="preserve">Map இல் unlisted businesses கண்டறியுங்கள். Search Businesses அழுத்துங்கள்.</w:t>
+        <w:t xml:space="preserve">படி 8: My Salons — filters &amp; search</w:t>
+      </w:r>
+    </w:p>
+    <w:p>
+      <w:pPr>
+        <w:spacing w:after="120"/>
+      </w:pPr>
+      <w:r>
+        <w:rPr>
+          <w:sz w:val="22"/>
+          <w:szCs w:val="22"/>
+        </w:rPr>
+        <w:t xml:space="preserve">Filter: All · In progress · Needs action · Live. Name, phone, Gmail, address, category மூலம் search. Manage = Field Editor. View = live listing. Add Salon = manual lead.</w:t>
+      </w:r>
+    </w:p>
+    <w:tbl>
+      <w:tblPr>
+        <w:tblW w:type="pct" w:w="100%"/>
+        <w:tblBorders>
+          <w:top w:val="single" w:color="auto" w:sz="4"/>
+          <w:left w:val="single" w:color="auto" w:sz="4"/>
+          <w:bottom w:val="single" w:color="auto" w:sz="4"/>
+          <w:right w:val="single" w:color="auto" w:sz="4"/>
+          <w:insideH w:val="single" w:color="auto" w:sz="4"/>
+          <w:insideV w:val="single" w:color="auto" w:sz="4"/>
+        </w:tblBorders>
+      </w:tblPr>
+      <w:tblGrid>
+        <w:gridCol w:w="100"/>
+      </w:tblGrid>
+      <w:tr>
+        <w:tc>
+          <w:tcPr>
+            <w:tcBorders>
+              <w:top w:val="single" w:color="F5B700" w:sz="1"/>
+              <w:left w:val="single" w:color="F5B700" w:sz="1"/>
+              <w:bottom w:val="single" w:color="F5B700" w:sz="1"/>
+              <w:right w:val="single" w:color="F5B700" w:sz="1"/>
+            </w:tcBorders>
+            <w:shd w:fill="FFF8E1" w:val="clear"/>
+          </w:tcPr>
+          <w:p>
+            <w:r>
+              <w:rPr>
+                <w:b/>
+                <w:bCs/>
+                <w:color w:val="92400E"/>
+                <w:sz w:val="20"/>
+                <w:szCs w:val="20"/>
+              </w:rPr>
+              <w:t xml:space="preserve">உதவிக்குறிப்பு: </w:t>
+            </w:r>
+            <w:r>
+              <w:rPr>
+                <w:color w:val="92400E"/>
+                <w:sz w:val="20"/>
+                <w:szCs w:val="20"/>
+              </w:rPr>
+              <w:t xml:space="preserve">Needs action = Assigned, Field verified, Owner invited — இன்றே owner follow-up.</w:t>
+            </w:r>
+          </w:p>
+        </w:tc>
+      </w:tr>
+    </w:tbl>
+    <w:p>
+      <w:pPr>
+        <w:pStyle w:val="Heading2"/>
+        <w:spacing w:after="120" w:before="280"/>
+      </w:pPr>
+      <w:r>
+        <w:rPr>
+          <w:b/>
+          <w:bCs/>
+          <w:color w:val="1A1C29"/>
+          <w:sz w:val="26"/>
+          <w:szCs w:val="26"/>
+        </w:rPr>
+        <w:t xml:space="preserve">படி 9: Status badges</w:t>
+      </w:r>
+    </w:p>
+    <w:p>
+      <w:pPr>
+        <w:spacing w:after="120"/>
+      </w:pPr>
+      <w:r>
+        <w:rPr>
+          <w:sz w:val="22"/>
+          <w:szCs w:val="22"/>
+        </w:rPr>
+        <w:t xml:space="preserve">Assigned → Field verified → Owner invited → Owner activated → Pending admin verification → Live/Verified. Rejected = admin follow-up தேவை.</w:t>
+      </w:r>
+    </w:p>
+    <w:p>
+      <w:pPr>
+        <w:spacing w:after="160"/>
+      </w:pPr>
+      <w:r>
+        <w:rPr>
+          <w:b/>
+          <w:bCs/>
+          <w:i/>
+          <w:iCs/>
+          <w:color w:val="71717A"/>
+          <w:sz w:val="20"/>
+          <w:szCs w:val="20"/>
+        </w:rPr>
+        <w:t xml:space="preserve">திரை: </w:t>
+      </w:r>
+      <w:r>
+        <w:rPr>
+          <w:i/>
+          <w:iCs/>
+          <w:color w:val="71717A"/>
+          <w:sz w:val="20"/>
+          <w:szCs w:val="20"/>
+        </w:rPr>
+        <w:t xml:space="preserve">Status badges</w:t>
+      </w:r>
+    </w:p>
+    <w:p>
+      <w:pPr>
+        <w:pStyle w:val="Heading2"/>
+        <w:spacing w:after="120" w:before="280"/>
+      </w:pPr>
+      <w:r>
+        <w:rPr>
+          <w:b/>
+          <w:bCs/>
+          <w:color w:val="1A1C29"/>
+          <w:sz w:val="26"/>
+          <w:szCs w:val="26"/>
+        </w:rPr>
+        <w:t xml:space="preserve">படி 10: Territory Explorer — leads கண்டறிதல்</w:t>
+      </w:r>
+    </w:p>
+    <w:p>
+      <w:pPr>
+        <w:spacing w:after="120"/>
+      </w:pPr>
+      <w:r>
+        <w:rPr>
+          <w:sz w:val="22"/>
+          <w:szCs w:val="22"/>
+        </w:rPr>
+        <w:t xml:space="preserve">Map இல் Trimma இல் இல்லாத businesses கண்டறியுங்கள். Category, territory, limit தேர்ந்தெடுத்து Search Businesses. Sidebar results. CSV export செய்து field visits திட்டமிடுங்கள்.</w:t>
       </w:r>
     </w:p>
     <w:p>
@@ -359,32 +678,191 @@
         <w:t xml:space="preserve">Territory Explorer</w:t>
       </w:r>
     </w:p>
-    <w:p>
-      <w:pPr>
-        <w:pStyle w:val="Heading2"/>
-        <w:spacing w:after="120" w:before="280"/>
-      </w:pPr>
-      <w:r>
-        <w:rPr>
-          <w:b/>
-          <w:bCs/>
-          <w:color w:val="1A1C29"/>
-          <w:sz w:val="26"/>
-          <w:szCs w:val="26"/>
-        </w:rPr>
-        <w:t xml:space="preserve">படி 6: Add Manual Lead</w:t>
-      </w:r>
-    </w:p>
-    <w:p>
-      <w:pPr>
-        <w:spacing w:after="120"/>
-      </w:pPr>
-      <w:r>
-        <w:rPr>
-          <w:sz w:val="22"/>
-          <w:szCs w:val="22"/>
-        </w:rPr>
-        <w:t xml:space="preserve">Field இல் salon கண்டால் manual lead உருவாக்குங்கள். Owner ஐ invite செய்யுங்கள்.</w:t>
+    <w:tbl>
+      <w:tblPr>
+        <w:tblW w:type="pct" w:w="100%"/>
+        <w:tblBorders>
+          <w:top w:val="single" w:color="auto" w:sz="4"/>
+          <w:left w:val="single" w:color="auto" w:sz="4"/>
+          <w:bottom w:val="single" w:color="auto" w:sz="4"/>
+          <w:right w:val="single" w:color="auto" w:sz="4"/>
+          <w:insideH w:val="single" w:color="auto" w:sz="4"/>
+          <w:insideV w:val="single" w:color="auto" w:sz="4"/>
+        </w:tblBorders>
+      </w:tblPr>
+      <w:tblGrid>
+        <w:gridCol w:w="100"/>
+      </w:tblGrid>
+      <w:tr>
+        <w:tc>
+          <w:tcPr>
+            <w:tcBorders>
+              <w:top w:val="single" w:color="F5B700" w:sz="1"/>
+              <w:left w:val="single" w:color="F5B700" w:sz="1"/>
+              <w:bottom w:val="single" w:color="F5B700" w:sz="1"/>
+              <w:right w:val="single" w:color="F5B700" w:sz="1"/>
+            </w:tcBorders>
+            <w:shd w:fill="FFF8E1" w:val="clear"/>
+          </w:tcPr>
+          <w:p>
+            <w:r>
+              <w:rPr>
+                <w:b/>
+                <w:bCs/>
+                <w:color w:val="92400E"/>
+                <w:sz w:val="20"/>
+                <w:szCs w:val="20"/>
+              </w:rPr>
+              <w:t xml:space="preserve">உதவிக்குறிப்பு: </w:t>
+            </w:r>
+            <w:r>
+              <w:rPr>
+                <w:color w:val="92400E"/>
+                <w:sz w:val="20"/>
+                <w:szCs w:val="20"/>
+              </w:rPr>
+              <w:t xml:space="preserve">Territories இல்லையெனில் admin ஐ தொடர்பு கொள்ளுங்கள்.</w:t>
+            </w:r>
+          </w:p>
+        </w:tc>
+      </w:tr>
+    </w:tbl>
+    <w:p>
+      <w:pPr>
+        <w:pStyle w:val="Heading2"/>
+        <w:spacing w:after="120" w:before="280"/>
+      </w:pPr>
+      <w:r>
+        <w:rPr>
+          <w:b/>
+          <w:bCs/>
+          <w:color w:val="1A1C29"/>
+          <w:sz w:val="26"/>
+          <w:szCs w:val="26"/>
+        </w:rPr>
+        <w:t xml:space="preserve">படி 11: Territory Explorer — field visits</w:t>
+      </w:r>
+    </w:p>
+    <w:p>
+      <w:pPr>
+        <w:spacing w:after="120"/>
+      </w:pPr>
+      <w:r>
+        <w:rPr>
+          <w:sz w:val="22"/>
+          <w:szCs w:val="22"/>
+        </w:rPr>
+        <w:t xml:space="preserve">CSV export, route plan, site visit, owner interest confirm. Admin Google lead assign செய்யும் வரை காத்திருக்கவும் அல்லது Add Manual Lead உருவாக்கவும்.</w:t>
+      </w:r>
+    </w:p>
+    <w:p>
+      <w:pPr>
+        <w:spacing w:after="160"/>
+      </w:pPr>
+      <w:r>
+        <w:rPr>
+          <w:b/>
+          <w:bCs/>
+          <w:i/>
+          <w:iCs/>
+          <w:color w:val="71717A"/>
+          <w:sz w:val="20"/>
+          <w:szCs w:val="20"/>
+        </w:rPr>
+        <w:t xml:space="preserve">திரை: </w:t>
+      </w:r>
+      <w:r>
+        <w:rPr>
+          <w:i/>
+          <w:iCs/>
+          <w:color w:val="71717A"/>
+          <w:sz w:val="20"/>
+          <w:szCs w:val="20"/>
+        </w:rPr>
+        <w:t xml:space="preserve">CSV + map</w:t>
+      </w:r>
+    </w:p>
+    <w:p>
+      <w:pPr>
+        <w:pStyle w:val="Heading2"/>
+        <w:spacing w:after="120" w:before="280"/>
+      </w:pPr>
+      <w:r>
+        <w:rPr>
+          <w:b/>
+          <w:bCs/>
+          <w:color w:val="1A1C29"/>
+          <w:sz w:val="26"/>
+          <w:szCs w:val="26"/>
+        </w:rPr>
+        <w:t xml:space="preserve">படி 12: Google Leads vs Manual Leads</w:t>
+      </w:r>
+    </w:p>
+    <w:p>
+      <w:pPr>
+        <w:spacing w:after="120"/>
+      </w:pPr>
+      <w:r>
+        <w:rPr>
+          <w:sz w:val="22"/>
+          <w:szCs w:val="22"/>
+        </w:rPr>
+        <w:t xml:space="preserve">Google Leads = admin assign (Google Leads tab). Manual Leads = field இல் நீங்கள் add செய்தவை. இரண்டும் ஒரே Field Editor pipeline.</w:t>
+      </w:r>
+    </w:p>
+    <w:p>
+      <w:pPr>
+        <w:spacing w:after="160"/>
+      </w:pPr>
+      <w:r>
+        <w:rPr>
+          <w:b/>
+          <w:bCs/>
+          <w:i/>
+          <w:iCs/>
+          <w:color w:val="71717A"/>
+          <w:sz w:val="20"/>
+          <w:szCs w:val="20"/>
+        </w:rPr>
+        <w:t xml:space="preserve">திரை: </w:t>
+      </w:r>
+      <w:r>
+        <w:rPr>
+          <w:i/>
+          <w:iCs/>
+          <w:color w:val="71717A"/>
+          <w:sz w:val="20"/>
+          <w:szCs w:val="20"/>
+        </w:rPr>
+        <w:t xml:space="preserve">Salon Creation tabs</w:t>
+      </w:r>
+    </w:p>
+    <w:p>
+      <w:pPr>
+        <w:pStyle w:val="Heading2"/>
+        <w:spacing w:after="120" w:before="280"/>
+      </w:pPr>
+      <w:r>
+        <w:rPr>
+          <w:b/>
+          <w:bCs/>
+          <w:color w:val="1A1C29"/>
+          <w:sz w:val="26"/>
+          <w:szCs w:val="26"/>
+        </w:rPr>
+        <w:t xml:space="preserve">படி 13: Add Manual Lead — form பூர்த்தி</w:t>
+      </w:r>
+    </w:p>
+    <w:p>
+      <w:pPr>
+        <w:spacing w:after="120"/>
+      </w:pPr>
+      <w:r>
+        <w:rPr>
+          <w:sz w:val="22"/>
+          <w:szCs w:val="22"/>
+        </w:rPr>
+        <w:t xml:space="preserve">Name, category, address, WhatsApp, owner Gmail, website, summary. Services 6 வரை, staff 2 வரை, amenities. Save as Draft அல்லது Send to Salon Owner for Review.</w:t>
       </w:r>
     </w:p>
     <w:p>
@@ -427,19 +905,19 @@
           <w:sz w:val="26"/>
           <w:szCs w:val="26"/>
         </w:rPr>
-        <w:t xml:space="preserve">படி 7: Salon Creation</w:t>
-      </w:r>
-    </w:p>
-    <w:p>
-      <w:pPr>
-        <w:spacing w:after="120"/>
-      </w:pPr>
-      <w:r>
-        <w:rPr>
-          <w:sz w:val="22"/>
-          <w:szCs w:val="22"/>
-        </w:rPr>
-        <w:t xml:space="preserve">Google leads மற்றும் manual leads ஐ ஒரே இடத்தில் process செய்யுங்கள்.</w:t>
+        <w:t xml:space="preserve">படி 14: Salon Creation hub</w:t>
+      </w:r>
+    </w:p>
+    <w:p>
+      <w:pPr>
+        <w:spacing w:after="120"/>
+      </w:pPr>
+      <w:r>
+        <w:rPr>
+          <w:sz w:val="22"/>
+          <w:szCs w:val="22"/>
+        </w:rPr>
+        <w:t xml:space="preserve">Field Editor command centre. Google Leads + Salon Leads tabs. Completion % மற்றும் checklist. Card click = Field Editor open.</w:t>
       </w:r>
     </w:p>
     <w:p>
@@ -482,129 +960,502 @@
           <w:sz w:val="26"/>
           <w:szCs w:val="26"/>
         </w:rPr>
-        <w:t xml:space="preserve">படி 8: Field Editor — 5 பிரிவுகள்</w:t>
-      </w:r>
-    </w:p>
-    <w:p>
-      <w:pPr>
-        <w:spacing w:after="120"/>
-      </w:pPr>
-      <w:r>
-        <w:rPr>
-          <w:sz w:val="22"/>
-          <w:szCs w:val="22"/>
-        </w:rPr>
-        <w:t xml:space="preserve">Salon &amp; Owner, Field Data, Services, Staff, Amenities.</w:t>
-      </w:r>
-    </w:p>
-    <w:p>
-      <w:pPr>
-        <w:spacing w:after="160"/>
-      </w:pPr>
-      <w:r>
-        <w:rPr>
-          <w:b/>
-          <w:bCs/>
-          <w:i/>
-          <w:iCs/>
-          <w:color w:val="71717A"/>
-          <w:sz w:val="20"/>
-          <w:szCs w:val="20"/>
-        </w:rPr>
-        <w:t xml:space="preserve">திரை: </w:t>
-      </w:r>
-      <w:r>
-        <w:rPr>
-          <w:i/>
-          <w:iCs/>
-          <w:color w:val="71717A"/>
-          <w:sz w:val="20"/>
-          <w:szCs w:val="20"/>
-        </w:rPr>
-        <w:t xml:space="preserve">Field Editor</w:t>
-      </w:r>
-    </w:p>
-    <w:p>
-      <w:pPr>
-        <w:pStyle w:val="Heading2"/>
-        <w:spacing w:after="120" w:before="280"/>
-      </w:pPr>
-      <w:r>
-        <w:rPr>
-          <w:b/>
-          <w:bCs/>
-          <w:color w:val="1A1C29"/>
-          <w:sz w:val="26"/>
-          <w:szCs w:val="26"/>
-        </w:rPr>
-        <w:t xml:space="preserve">படி 9: Salon owner ஐ invite செய்யுங்கள்</w:t>
-      </w:r>
-    </w:p>
-    <w:p>
-      <w:pPr>
-        <w:spacing w:after="120"/>
-      </w:pPr>
-      <w:r>
-        <w:rPr>
-          <w:sz w:val="22"/>
-          <w:szCs w:val="22"/>
-        </w:rPr>
-        <w:t xml:space="preserve">Owner Gmail + WhatsApp பூர்த்தி செய்து Send Invitation பயன்படுத்துங்கள்.</w:t>
-      </w:r>
-    </w:p>
-    <w:p>
-      <w:pPr>
-        <w:spacing w:after="160"/>
-      </w:pPr>
-      <w:r>
-        <w:rPr>
-          <w:b/>
-          <w:bCs/>
-          <w:i/>
-          <w:iCs/>
-          <w:color w:val="71717A"/>
-          <w:sz w:val="20"/>
-          <w:szCs w:val="20"/>
-        </w:rPr>
-        <w:t xml:space="preserve">திரை: </w:t>
-      </w:r>
-      <w:r>
-        <w:rPr>
-          <w:i/>
-          <w:iCs/>
-          <w:color w:val="71717A"/>
-          <w:sz w:val="20"/>
-          <w:szCs w:val="20"/>
-        </w:rPr>
-        <w:t xml:space="preserve">Send Invitation</w:t>
-      </w:r>
-    </w:p>
-    <w:p>
-      <w:pPr>
-        <w:pStyle w:val="Heading2"/>
-        <w:spacing w:after="120" w:before="280"/>
-      </w:pPr>
-      <w:r>
-        <w:rPr>
-          <w:b/>
-          <w:bCs/>
-          <w:color w:val="1A1C29"/>
-          <w:sz w:val="26"/>
-          <w:szCs w:val="26"/>
-        </w:rPr>
-        <w:t xml:space="preserve">படி 10: Salon Approval queue</w:t>
-      </w:r>
-    </w:p>
-    <w:p>
-      <w:pPr>
-        <w:spacing w:after="120"/>
-      </w:pPr>
-      <w:r>
-        <w:rPr>
-          <w:sz w:val="22"/>
-          <w:szCs w:val="22"/>
-        </w:rPr>
-        <w:t xml:space="preserve">Owner activated பிறகு review செய்து Enable Booking &amp; Send to Admin செய்யுங்கள்.</w:t>
+        <w:t xml:space="preserve">படி 15: Field Editor — பிரிவு 1: Salon &amp; Owner</w:t>
+      </w:r>
+    </w:p>
+    <w:p>
+      <w:pPr>
+        <w:spacing w:after="120"/>
+      </w:pPr>
+      <w:r>
+        <w:rPr>
+          <w:sz w:val="22"/>
+          <w:szCs w:val="22"/>
+        </w:rPr>
+        <w:t xml:space="preserve">Name, category, address, WhatsApp, owner Gmail, hero image, summary verify. Owner Gmail = Google sign-in account.</w:t>
+      </w:r>
+    </w:p>
+    <w:p>
+      <w:pPr>
+        <w:spacing w:after="160"/>
+      </w:pPr>
+      <w:r>
+        <w:rPr>
+          <w:b/>
+          <w:bCs/>
+          <w:i/>
+          <w:iCs/>
+          <w:color w:val="71717A"/>
+          <w:sz w:val="20"/>
+          <w:szCs w:val="20"/>
+        </w:rPr>
+        <w:t xml:space="preserve">திரை: </w:t>
+      </w:r>
+      <w:r>
+        <w:rPr>
+          <w:i/>
+          <w:iCs/>
+          <w:color w:val="71717A"/>
+          <w:sz w:val="20"/>
+          <w:szCs w:val="20"/>
+        </w:rPr>
+        <w:t xml:space="preserve">Section 1</w:t>
+      </w:r>
+    </w:p>
+    <w:p>
+      <w:pPr>
+        <w:pStyle w:val="Heading2"/>
+        <w:spacing w:after="120" w:before="280"/>
+      </w:pPr>
+      <w:r>
+        <w:rPr>
+          <w:b/>
+          <w:bCs/>
+          <w:color w:val="1A1C29"/>
+          <w:sz w:val="26"/>
+          <w:szCs w:val="26"/>
+        </w:rPr>
+        <w:t xml:space="preserve">படி 16: Field Editor — பிரிவு 2: Agent Field Data</w:t>
+      </w:r>
+    </w:p>
+    <w:p>
+      <w:pPr>
+        <w:spacing w:after="120"/>
+      </w:pPr>
+      <w:r>
+        <w:rPr>
+          <w:sz w:val="22"/>
+          <w:szCs w:val="22"/>
+        </w:rPr>
+        <w:t xml:space="preserve">Agent notes, working hours (OPEN/CLOSED), map link, coordinates. Hours = live பிறகு booking slots.</w:t>
+      </w:r>
+    </w:p>
+    <w:p>
+      <w:pPr>
+        <w:spacing w:after="160"/>
+      </w:pPr>
+      <w:r>
+        <w:rPr>
+          <w:b/>
+          <w:bCs/>
+          <w:i/>
+          <w:iCs/>
+          <w:color w:val="71717A"/>
+          <w:sz w:val="20"/>
+          <w:szCs w:val="20"/>
+        </w:rPr>
+        <w:t xml:space="preserve">திரை: </w:t>
+      </w:r>
+      <w:r>
+        <w:rPr>
+          <w:i/>
+          <w:iCs/>
+          <w:color w:val="71717A"/>
+          <w:sz w:val="20"/>
+          <w:szCs w:val="20"/>
+        </w:rPr>
+        <w:t xml:space="preserve">Section 2</w:t>
+      </w:r>
+    </w:p>
+    <w:tbl>
+      <w:tblPr>
+        <w:tblW w:type="pct" w:w="100%"/>
+        <w:tblBorders>
+          <w:top w:val="single" w:color="auto" w:sz="4"/>
+          <w:left w:val="single" w:color="auto" w:sz="4"/>
+          <w:bottom w:val="single" w:color="auto" w:sz="4"/>
+          <w:right w:val="single" w:color="auto" w:sz="4"/>
+          <w:insideH w:val="single" w:color="auto" w:sz="4"/>
+          <w:insideV w:val="single" w:color="auto" w:sz="4"/>
+        </w:tblBorders>
+      </w:tblPr>
+      <w:tblGrid>
+        <w:gridCol w:w="100"/>
+      </w:tblGrid>
+      <w:tr>
+        <w:tc>
+          <w:tcPr>
+            <w:tcBorders>
+              <w:top w:val="single" w:color="F5B700" w:sz="1"/>
+              <w:left w:val="single" w:color="F5B700" w:sz="1"/>
+              <w:bottom w:val="single" w:color="F5B700" w:sz="1"/>
+              <w:right w:val="single" w:color="F5B700" w:sz="1"/>
+            </w:tcBorders>
+            <w:shd w:fill="FFF8E1" w:val="clear"/>
+          </w:tcPr>
+          <w:p>
+            <w:r>
+              <w:rPr>
+                <w:b/>
+                <w:bCs/>
+                <w:color w:val="92400E"/>
+                <w:sz w:val="20"/>
+                <w:szCs w:val="20"/>
+              </w:rPr>
+              <w:t xml:space="preserve">உதவிக்குறிப்பு: </w:t>
+            </w:r>
+            <w:r>
+              <w:rPr>
+                <w:color w:val="92400E"/>
+                <w:sz w:val="20"/>
+                <w:szCs w:val="20"/>
+              </w:rPr>
+              <w:t xml:space="preserve">சரியான hours = customer complaints குறைவு.</w:t>
+            </w:r>
+          </w:p>
+        </w:tc>
+      </w:tr>
+    </w:tbl>
+    <w:p>
+      <w:pPr>
+        <w:pStyle w:val="Heading2"/>
+        <w:spacing w:after="120" w:before="280"/>
+      </w:pPr>
+      <w:r>
+        <w:rPr>
+          <w:b/>
+          <w:bCs/>
+          <w:color w:val="1A1C29"/>
+          <w:sz w:val="26"/>
+          <w:szCs w:val="26"/>
+        </w:rPr>
+        <w:t xml:space="preserve">படி 17: Field Editor — பிரிவு 3: Services</w:t>
+      </w:r>
+    </w:p>
+    <w:p>
+      <w:pPr>
+        <w:spacing w:after="120"/>
+      </w:pPr>
+      <w:r>
+        <w:rPr>
+          <w:sz w:val="22"/>
+          <w:szCs w:val="22"/>
+        </w:rPr>
+        <w:t xml:space="preserve">Services 6 வரை — name, price (LKR), duration. எ.கா: Classic Haircut LKR 750, 30 min.</w:t>
+      </w:r>
+    </w:p>
+    <w:p>
+      <w:pPr>
+        <w:spacing w:after="160"/>
+      </w:pPr>
+      <w:r>
+        <w:rPr>
+          <w:b/>
+          <w:bCs/>
+          <w:i/>
+          <w:iCs/>
+          <w:color w:val="71717A"/>
+          <w:sz w:val="20"/>
+          <w:szCs w:val="20"/>
+        </w:rPr>
+        <w:t xml:space="preserve">திரை: </w:t>
+      </w:r>
+      <w:r>
+        <w:rPr>
+          <w:i/>
+          <w:iCs/>
+          <w:color w:val="71717A"/>
+          <w:sz w:val="20"/>
+          <w:szCs w:val="20"/>
+        </w:rPr>
+        <w:t xml:space="preserve">Section 3</w:t>
+      </w:r>
+    </w:p>
+    <w:p>
+      <w:pPr>
+        <w:pStyle w:val="Heading2"/>
+        <w:spacing w:after="120" w:before="280"/>
+      </w:pPr>
+      <w:r>
+        <w:rPr>
+          <w:b/>
+          <w:bCs/>
+          <w:color w:val="1A1C29"/>
+          <w:sz w:val="26"/>
+          <w:szCs w:val="26"/>
+        </w:rPr>
+        <w:t xml:space="preserve">படி 18: Field Editor — பிரிவு 4: Staff</w:t>
+      </w:r>
+    </w:p>
+    <w:p>
+      <w:pPr>
+        <w:spacing w:after="120"/>
+      </w:pPr>
+      <w:r>
+        <w:rPr>
+          <w:sz w:val="22"/>
+          <w:szCs w:val="22"/>
+        </w:rPr>
+        <w:t xml:space="preserve">Staff 2 வரை — name, photo, role, schedule. Customers booking இல் stylist தேர்வு.</w:t>
+      </w:r>
+    </w:p>
+    <w:p>
+      <w:pPr>
+        <w:spacing w:after="160"/>
+      </w:pPr>
+      <w:r>
+        <w:rPr>
+          <w:b/>
+          <w:bCs/>
+          <w:i/>
+          <w:iCs/>
+          <w:color w:val="71717A"/>
+          <w:sz w:val="20"/>
+          <w:szCs w:val="20"/>
+        </w:rPr>
+        <w:t xml:space="preserve">திரை: </w:t>
+      </w:r>
+      <w:r>
+        <w:rPr>
+          <w:i/>
+          <w:iCs/>
+          <w:color w:val="71717A"/>
+          <w:sz w:val="20"/>
+          <w:szCs w:val="20"/>
+        </w:rPr>
+        <w:t xml:space="preserve">Section 4</w:t>
+      </w:r>
+    </w:p>
+    <w:p>
+      <w:pPr>
+        <w:pStyle w:val="Heading2"/>
+        <w:spacing w:after="120" w:before="280"/>
+      </w:pPr>
+      <w:r>
+        <w:rPr>
+          <w:b/>
+          <w:bCs/>
+          <w:color w:val="1A1C29"/>
+          <w:sz w:val="26"/>
+          <w:szCs w:val="26"/>
+        </w:rPr>
+        <w:t xml:space="preserve">படி 19: Field Editor — பிரிவு 5: Amenities</w:t>
+      </w:r>
+    </w:p>
+    <w:p>
+      <w:pPr>
+        <w:spacing w:after="120"/>
+      </w:pPr>
+      <w:r>
+        <w:rPr>
+          <w:sz w:val="22"/>
+          <w:szCs w:val="22"/>
+        </w:rPr>
+        <w:t xml:space="preserve">AC, parking, WiFi, card payment tick செய்யுங்கள். Customers சரியான தகவல் பெறுவர்.</w:t>
+      </w:r>
+    </w:p>
+    <w:p>
+      <w:pPr>
+        <w:spacing w:after="160"/>
+      </w:pPr>
+      <w:r>
+        <w:rPr>
+          <w:b/>
+          <w:bCs/>
+          <w:i/>
+          <w:iCs/>
+          <w:color w:val="71717A"/>
+          <w:sz w:val="20"/>
+          <w:szCs w:val="20"/>
+        </w:rPr>
+        <w:t xml:space="preserve">திரை: </w:t>
+      </w:r>
+      <w:r>
+        <w:rPr>
+          <w:i/>
+          <w:iCs/>
+          <w:color w:val="71717A"/>
+          <w:sz w:val="20"/>
+          <w:szCs w:val="20"/>
+        </w:rPr>
+        <w:t xml:space="preserve">Section 5</w:t>
+      </w:r>
+    </w:p>
+    <w:p>
+      <w:pPr>
+        <w:pStyle w:val="Heading2"/>
+        <w:spacing w:after="120" w:before="280"/>
+      </w:pPr>
+      <w:r>
+        <w:rPr>
+          <w:b/>
+          <w:bCs/>
+          <w:color w:val="1A1C29"/>
+          <w:sz w:val="26"/>
+          <w:szCs w:val="26"/>
+        </w:rPr>
+        <w:t xml:space="preserve">படி 20: Save, invite, resend</w:t>
+      </w:r>
+    </w:p>
+    <w:p>
+      <w:pPr>
+        <w:spacing w:after="120"/>
+      </w:pPr>
+      <w:r>
+        <w:rPr>
+          <w:sz w:val="22"/>
+          <w:szCs w:val="22"/>
+        </w:rPr>
+        <w:t xml:space="preserve">Save = draft. Send to Owner for Review = phone + Gmail. Send Invitation = Owner invited. Resend = 48 மணி activate இல்லையெனில்.</w:t>
+      </w:r>
+    </w:p>
+    <w:p>
+      <w:pPr>
+        <w:spacing w:after="160"/>
+      </w:pPr>
+      <w:r>
+        <w:rPr>
+          <w:b/>
+          <w:bCs/>
+          <w:i/>
+          <w:iCs/>
+          <w:color w:val="71717A"/>
+          <w:sz w:val="20"/>
+          <w:szCs w:val="20"/>
+        </w:rPr>
+        <w:t xml:space="preserve">திரை: </w:t>
+      </w:r>
+      <w:r>
+        <w:rPr>
+          <w:i/>
+          <w:iCs/>
+          <w:color w:val="71717A"/>
+          <w:sz w:val="20"/>
+          <w:szCs w:val="20"/>
+        </w:rPr>
+        <w:t xml:space="preserve">Action buttons</w:t>
+      </w:r>
+    </w:p>
+    <w:tbl>
+      <w:tblPr>
+        <w:tblW w:type="pct" w:w="100%"/>
+        <w:tblBorders>
+          <w:top w:val="single" w:color="auto" w:sz="4"/>
+          <w:left w:val="single" w:color="auto" w:sz="4"/>
+          <w:bottom w:val="single" w:color="auto" w:sz="4"/>
+          <w:right w:val="single" w:color="auto" w:sz="4"/>
+          <w:insideH w:val="single" w:color="auto" w:sz="4"/>
+          <w:insideV w:val="single" w:color="auto" w:sz="4"/>
+        </w:tblBorders>
+      </w:tblPr>
+      <w:tblGrid>
+        <w:gridCol w:w="100"/>
+      </w:tblGrid>
+      <w:tr>
+        <w:tc>
+          <w:tcPr>
+            <w:tcBorders>
+              <w:top w:val="single" w:color="F5B700" w:sz="1"/>
+              <w:left w:val="single" w:color="F5B700" w:sz="1"/>
+              <w:bottom w:val="single" w:color="F5B700" w:sz="1"/>
+              <w:right w:val="single" w:color="F5B700" w:sz="1"/>
+            </w:tcBorders>
+            <w:shd w:fill="FFF8E1" w:val="clear"/>
+          </w:tcPr>
+          <w:p>
+            <w:r>
+              <w:rPr>
+                <w:b/>
+                <w:bCs/>
+                <w:color w:val="92400E"/>
+                <w:sz w:val="20"/>
+                <w:szCs w:val="20"/>
+              </w:rPr>
+              <w:t xml:space="preserve">உதவிக்குறிப்பு: </w:t>
+            </w:r>
+            <w:r>
+              <w:rPr>
+                <w:color w:val="92400E"/>
+                <w:sz w:val="20"/>
+                <w:szCs w:val="20"/>
+              </w:rPr>
+              <w:t xml:space="preserve">Owner Trimma க்கு ஒப்புக்கொண்ட பிறகு மட்டும் invite.</w:t>
+            </w:r>
+          </w:p>
+        </w:tc>
+      </w:tr>
+    </w:tbl>
+    <w:p>
+      <w:pPr>
+        <w:pStyle w:val="Heading2"/>
+        <w:spacing w:after="120" w:before="280"/>
+      </w:pPr>
+      <w:r>
+        <w:rPr>
+          <w:b/>
+          <w:bCs/>
+          <w:color w:val="1A1C29"/>
+          <w:sz w:val="26"/>
+          <w:szCs w:val="26"/>
+        </w:rPr>
+        <w:t xml:space="preserve">படி 21: Owner activation</w:t>
+      </w:r>
+    </w:p>
+    <w:p>
+      <w:pPr>
+        <w:spacing w:after="120"/>
+      </w:pPr>
+      <w:r>
+        <w:rPr>
+          <w:sz w:val="22"/>
+          <w:szCs w:val="22"/>
+        </w:rPr>
+        <w:t xml:space="preserve">Owner invite link click, Google sign-in, profile complete. Status = Owner activated. My Salons &amp; Salon Approval இல் காணலாம்.</w:t>
+      </w:r>
+    </w:p>
+    <w:p>
+      <w:pPr>
+        <w:spacing w:after="160"/>
+      </w:pPr>
+      <w:r>
+        <w:rPr>
+          <w:b/>
+          <w:bCs/>
+          <w:i/>
+          <w:iCs/>
+          <w:color w:val="71717A"/>
+          <w:sz w:val="20"/>
+          <w:szCs w:val="20"/>
+        </w:rPr>
+        <w:t xml:space="preserve">திரை: </w:t>
+      </w:r>
+      <w:r>
+        <w:rPr>
+          <w:i/>
+          <w:iCs/>
+          <w:color w:val="71717A"/>
+          <w:sz w:val="20"/>
+          <w:szCs w:val="20"/>
+        </w:rPr>
+        <w:t xml:space="preserve">Owner activated</w:t>
+      </w:r>
+    </w:p>
+    <w:p>
+      <w:pPr>
+        <w:pStyle w:val="Heading2"/>
+        <w:spacing w:after="120" w:before="280"/>
+      </w:pPr>
+      <w:r>
+        <w:rPr>
+          <w:b/>
+          <w:bCs/>
+          <w:color w:val="1A1C29"/>
+          <w:sz w:val="26"/>
+          <w:szCs w:val="26"/>
+        </w:rPr>
+        <w:t xml:space="preserve">படி 22: Salon Approval queue</w:t>
+      </w:r>
+    </w:p>
+    <w:p>
+      <w:pPr>
+        <w:spacing w:after="120"/>
+      </w:pPr>
+      <w:r>
+        <w:rPr>
+          <w:sz w:val="22"/>
+          <w:szCs w:val="22"/>
+        </w:rPr>
+        <w:t xml:space="preserve">Owner activated salons Pending Review. Services, bank, branding review. Field Editor இல் Enable Booking &amp; Send to Admin.</w:t>
       </w:r>
     </w:p>
     <w:p>
@@ -647,74 +1498,129 @@
           <w:sz w:val="26"/>
           <w:szCs w:val="26"/>
         </w:rPr>
-        <w:t xml:space="preserve">படி 11: Admin verification → Live</w:t>
-      </w:r>
-    </w:p>
-    <w:p>
-      <w:pPr>
-        <w:spacing w:after="120"/>
-      </w:pPr>
-      <w:r>
-        <w:rPr>
-          <w:sz w:val="22"/>
-          <w:szCs w:val="22"/>
-        </w:rPr>
-        <w:t xml:space="preserve">Admin approve செய்த பிறகு salon marketplace இல் public ஆகிறது.</w:t>
-      </w:r>
-    </w:p>
-    <w:p>
-      <w:pPr>
-        <w:spacing w:after="160"/>
-      </w:pPr>
-      <w:r>
-        <w:rPr>
-          <w:b/>
-          <w:bCs/>
-          <w:i/>
-          <w:iCs/>
-          <w:color w:val="71717A"/>
-          <w:sz w:val="20"/>
-          <w:szCs w:val="20"/>
-        </w:rPr>
-        <w:t xml:space="preserve">திரை: </w:t>
-      </w:r>
-      <w:r>
-        <w:rPr>
-          <w:i/>
-          <w:iCs/>
-          <w:color w:val="71717A"/>
-          <w:sz w:val="20"/>
-          <w:szCs w:val="20"/>
-        </w:rPr>
-        <w:t xml:space="preserve">Verified status</w:t>
-      </w:r>
-    </w:p>
-    <w:p>
-      <w:pPr>
-        <w:pStyle w:val="Heading2"/>
-        <w:spacing w:after="120" w:before="280"/>
-      </w:pPr>
-      <w:r>
-        <w:rPr>
-          <w:b/>
-          <w:bCs/>
-          <w:color w:val="1A1C29"/>
-          <w:sz w:val="26"/>
-          <w:szCs w:val="26"/>
-        </w:rPr>
-        <w:t xml:space="preserve">படி 12: Commissions</w:t>
-      </w:r>
-    </w:p>
-    <w:p>
-      <w:pPr>
-        <w:spacing w:after="120"/>
-      </w:pPr>
-      <w:r>
-        <w:rPr>
-          <w:sz w:val="22"/>
-          <w:szCs w:val="22"/>
-        </w:rPr>
-        <w:t xml:space="preserve">Weekly booking commissions மற்றும் subscription rewards track செய்யுங்கள்.</w:t>
+        <w:t xml:space="preserve">படி 23: Enable booking &amp; admin submit</w:t>
+      </w:r>
+    </w:p>
+    <w:p>
+      <w:pPr>
+        <w:spacing w:after="120"/>
+      </w:pPr>
+      <w:r>
+        <w:rPr>
+          <w:sz w:val="22"/>
+          <w:szCs w:val="22"/>
+        </w:rPr>
+        <w:t xml:space="preserve">Enable Booking &amp; Send to Admin = booking on + admin queue. Status = Pending admin verification.</w:t>
+      </w:r>
+    </w:p>
+    <w:p>
+      <w:pPr>
+        <w:spacing w:after="160"/>
+      </w:pPr>
+      <w:r>
+        <w:rPr>
+          <w:b/>
+          <w:bCs/>
+          <w:i/>
+          <w:iCs/>
+          <w:color w:val="71717A"/>
+          <w:sz w:val="20"/>
+          <w:szCs w:val="20"/>
+        </w:rPr>
+        <w:t xml:space="preserve">திரை: </w:t>
+      </w:r>
+      <w:r>
+        <w:rPr>
+          <w:i/>
+          <w:iCs/>
+          <w:color w:val="71717A"/>
+          <w:sz w:val="20"/>
+          <w:szCs w:val="20"/>
+        </w:rPr>
+        <w:t xml:space="preserve">Enable Booking</w:t>
+      </w:r>
+    </w:p>
+    <w:p>
+      <w:pPr>
+        <w:pStyle w:val="Heading2"/>
+        <w:spacing w:after="120" w:before="280"/>
+      </w:pPr>
+      <w:r>
+        <w:rPr>
+          <w:b/>
+          <w:bCs/>
+          <w:color w:val="1A1C29"/>
+          <w:sz w:val="26"/>
+          <w:szCs w:val="26"/>
+        </w:rPr>
+        <w:t xml:space="preserve">படி 24: Admin verification → Live</w:t>
+      </w:r>
+    </w:p>
+    <w:p>
+      <w:pPr>
+        <w:spacing w:after="120"/>
+      </w:pPr>
+      <w:r>
+        <w:rPr>
+          <w:sz w:val="22"/>
+          <w:szCs w:val="22"/>
+        </w:rPr>
+        <w:t xml:space="preserve">Admin approve பிறகு Verified — marketplace public. Customers book, commissions உங்களுக்கு.</w:t>
+      </w:r>
+    </w:p>
+    <w:p>
+      <w:pPr>
+        <w:spacing w:after="160"/>
+      </w:pPr>
+      <w:r>
+        <w:rPr>
+          <w:b/>
+          <w:bCs/>
+          <w:i/>
+          <w:iCs/>
+          <w:color w:val="71717A"/>
+          <w:sz w:val="20"/>
+          <w:szCs w:val="20"/>
+        </w:rPr>
+        <w:t xml:space="preserve">திரை: </w:t>
+      </w:r>
+      <w:r>
+        <w:rPr>
+          <w:i/>
+          <w:iCs/>
+          <w:color w:val="71717A"/>
+          <w:sz w:val="20"/>
+          <w:szCs w:val="20"/>
+        </w:rPr>
+        <w:t xml:space="preserve">Verified</w:t>
+      </w:r>
+    </w:p>
+    <w:p>
+      <w:pPr>
+        <w:pStyle w:val="Heading2"/>
+        <w:spacing w:after="120" w:before="280"/>
+      </w:pPr>
+      <w:r>
+        <w:rPr>
+          <w:b/>
+          <w:bCs/>
+          <w:color w:val="1A1C29"/>
+          <w:sz w:val="26"/>
+          <w:szCs w:val="26"/>
+        </w:rPr>
+        <w:t xml:space="preserve">படி 25: Commissions</w:t>
+      </w:r>
+    </w:p>
+    <w:p>
+      <w:pPr>
+        <w:spacing w:after="120"/>
+      </w:pPr>
+      <w:r>
+        <w:rPr>
+          <w:sz w:val="22"/>
+          <w:szCs w:val="22"/>
+        </w:rPr>
+        <w:t xml:space="preserve">Weekly ledger — booking % &amp; subscription %. Booking + Subscription Commissions. Week navigation &amp; all-time volume.</w:t>
       </w:r>
     </w:p>
     <w:p>
@@ -757,19 +1663,19 @@
           <w:sz w:val="26"/>
           <w:szCs w:val="26"/>
         </w:rPr>
-        <w:t xml:space="preserve">படி 13: Work Queue</w:t>
-      </w:r>
-    </w:p>
-    <w:p>
-      <w:pPr>
-        <w:spacing w:after="120"/>
-      </w:pPr>
-      <w:r>
-        <w:rPr>
-          <w:sz w:val="22"/>
-          <w:szCs w:val="22"/>
-        </w:rPr>
-        <w:t xml:space="preserve">Prioritized tasks — follow-ups, alerts, stalled onboarding.</w:t>
+        <w:t xml:space="preserve">படி 26: Work Queue</w:t>
+      </w:r>
+    </w:p>
+    <w:p>
+      <w:pPr>
+        <w:spacing w:after="120"/>
+      </w:pPr>
+      <w:r>
+        <w:rPr>
+          <w:sz w:val="22"/>
+          <w:szCs w:val="22"/>
+        </w:rPr>
+        <w:t xml:space="preserve">Prioritized tasks — follow-ups, stalled onboarding, alerts. HIGH = urgent. Recommended action click.</w:t>
       </w:r>
     </w:p>
     <w:p>
@@ -812,19 +1718,19 @@
           <w:sz w:val="26"/>
           <w:szCs w:val="26"/>
         </w:rPr>
-        <w:t xml:space="preserve">படி 14: My Profile</w:t>
-      </w:r>
-    </w:p>
-    <w:p>
-      <w:pPr>
-        <w:spacing w:after="120"/>
-      </w:pPr>
-      <w:r>
-        <w:rPr>
-          <w:sz w:val="22"/>
-          <w:szCs w:val="22"/>
-        </w:rPr>
-        <w:t xml:space="preserve">Photo, name, phone update செய்யுங்கள்.</w:t>
+        <w:t xml:space="preserve">படி 27: My Profile</w:t>
+      </w:r>
+    </w:p>
+    <w:p>
+      <w:pPr>
+        <w:spacing w:after="120"/>
+      </w:pPr>
+      <w:r>
+        <w:rPr>
+          <w:sz w:val="22"/>
+          <w:szCs w:val="22"/>
+        </w:rPr>
+        <w:t xml:space="preserve">Photo, name, phone update. Email &amp; territories admin-managed. Phone current வைத்திருங்கள்.</w:t>
       </w:r>
     </w:p>
     <w:p>
@@ -867,19 +1773,19 @@
           <w:sz w:val="26"/>
           <w:szCs w:val="26"/>
         </w:rPr>
-        <w:t xml:space="preserve">படி 15: Onboarding pipeline</w:t>
-      </w:r>
-    </w:p>
-    <w:p>
-      <w:pPr>
-        <w:spacing w:after="120"/>
-      </w:pPr>
-      <w:r>
-        <w:rPr>
-          <w:sz w:val="22"/>
-          <w:szCs w:val="22"/>
-        </w:rPr>
-        <w:t xml:space="preserve">Assigned → Field verified → Owner invited → Owner activated → Verified.</w:t>
+        <w:t xml:space="preserve">படி 28: Onboarding pipeline</w:t>
+      </w:r>
+    </w:p>
+    <w:p>
+      <w:pPr>
+        <w:spacing w:after="120"/>
+      </w:pPr>
+      <w:r>
+        <w:rPr>
+          <w:sz w:val="22"/>
+          <w:szCs w:val="22"/>
+        </w:rPr>
+        <w:t xml:space="preserve">Assigned → Field verified → Owner invited → Owner activated → Admin verification → Live/Verified. ஒவ்வொரு stage-உம் stall இல்லாமல்.</w:t>
       </w:r>
     </w:p>
     <w:p>
@@ -907,6 +1813,138 @@
           <w:szCs w:val="20"/>
         </w:rPr>
         <w:t xml:space="preserve">Pipeline</w:t>
+      </w:r>
+    </w:p>
+    <w:p>
+      <w:pPr>
+        <w:pStyle w:val="Heading2"/>
+        <w:spacing w:after="120" w:before="280"/>
+      </w:pPr>
+      <w:r>
+        <w:rPr>
+          <w:b/>
+          <w:bCs/>
+          <w:color w:val="1A1C29"/>
+          <w:sz w:val="26"/>
+          <w:szCs w:val="26"/>
+        </w:rPr>
+        <w:t xml:space="preserve">படி 29: தவிர்க்க வேண்டிய பிழைகள்</w:t>
+      </w:r>
+    </w:p>
+    <w:p>
+      <w:pPr>
+        <w:spacing w:after="120"/>
+      </w:pPr>
+      <w:r>
+        <w:rPr>
+          <w:sz w:val="22"/>
+          <w:szCs w:val="22"/>
+        </w:rPr>
+        <w:t xml:space="preserve">தவறான owner Gmail. Services/prices missing. Field visit இல்லை. Owner ஒப்புதல் இல்லாமல் invite. தவறான hours. Owner invited இல் stall.</w:t>
+      </w:r>
+    </w:p>
+    <w:tbl>
+      <w:tblPr>
+        <w:tblW w:type="pct" w:w="100%"/>
+        <w:tblBorders>
+          <w:top w:val="single" w:color="auto" w:sz="4"/>
+          <w:left w:val="single" w:color="auto" w:sz="4"/>
+          <w:bottom w:val="single" w:color="auto" w:sz="4"/>
+          <w:right w:val="single" w:color="auto" w:sz="4"/>
+          <w:insideH w:val="single" w:color="auto" w:sz="4"/>
+          <w:insideV w:val="single" w:color="auto" w:sz="4"/>
+        </w:tblBorders>
+      </w:tblPr>
+      <w:tblGrid>
+        <w:gridCol w:w="100"/>
+      </w:tblGrid>
+      <w:tr>
+        <w:tc>
+          <w:tcPr>
+            <w:tcBorders>
+              <w:top w:val="single" w:color="F5B700" w:sz="1"/>
+              <w:left w:val="single" w:color="F5B700" w:sz="1"/>
+              <w:bottom w:val="single" w:color="F5B700" w:sz="1"/>
+              <w:right w:val="single" w:color="F5B700" w:sz="1"/>
+            </w:tcBorders>
+            <w:shd w:fill="FFF8E1" w:val="clear"/>
+          </w:tcPr>
+          <w:p>
+            <w:r>
+              <w:rPr>
+                <w:b/>
+                <w:bCs/>
+                <w:color w:val="92400E"/>
+                <w:sz w:val="20"/>
+                <w:szCs w:val="20"/>
+              </w:rPr>
+              <w:t xml:space="preserve">உதவிக்குறிப்பு: </w:t>
+            </w:r>
+            <w:r>
+              <w:rPr>
+                <w:color w:val="92400E"/>
+                <w:sz w:val="20"/>
+                <w:szCs w:val="20"/>
+              </w:rPr>
+              <w:t xml:space="preserve">Salon Creation checklist — invite முன் 100% completion.</w:t>
+            </w:r>
+          </w:p>
+        </w:tc>
+      </w:tr>
+    </w:tbl>
+    <w:p>
+      <w:pPr>
+        <w:pStyle w:val="Heading2"/>
+        <w:spacing w:after="120" w:before="280"/>
+      </w:pPr>
+      <w:r>
+        <w:rPr>
+          <w:b/>
+          <w:bCs/>
+          <w:color w:val="1A1C29"/>
+          <w:sz w:val="26"/>
+          <w:szCs w:val="26"/>
+        </w:rPr>
+        <w:t xml:space="preserve">படி 30: Support</w:t>
+      </w:r>
+    </w:p>
+    <w:p>
+      <w:pPr>
+        <w:spacing w:after="120"/>
+      </w:pPr>
+      <w:r>
+        <w:rPr>
+          <w:sz w:val="22"/>
+          <w:szCs w:val="22"/>
+        </w:rPr>
+        <w:t xml:space="preserve">agents@trimma.com — territory, commission, approval. Salon name + owner Gmail சேர்க்கவும். Agent Help இல் full guide &amp; EN/SI/TA Word downloads.</w:t>
+      </w:r>
+    </w:p>
+    <w:p>
+      <w:pPr>
+        <w:spacing w:after="160"/>
+      </w:pPr>
+      <w:r>
+        <w:rPr>
+          <w:b/>
+          <w:bCs/>
+          <w:i/>
+          <w:iCs/>
+          <w:color w:val="71717A"/>
+          <w:sz w:val="20"/>
+          <w:szCs w:val="20"/>
+        </w:rPr>
+        <w:t xml:space="preserve">திரை: </w:t>
+      </w:r>
+      <w:r>
+        <w:rPr>
+          <w:i/>
+          <w:iCs/>
+          <w:color w:val="71717A"/>
+          <w:sz w:val="20"/>
+          <w:szCs w:val="20"/>
+        </w:rPr>
+        <w:t xml:space="preserve">Support</w:t>
       </w:r>
     </w:p>
     <w:p>

</xml_diff>